<commit_message>
Organizando las carpetas separadas
</commit_message>
<xml_diff>
--- a/AA3-EV05 - Práctica de clase – Scaffolding inicial del Front-End del proyecto sus L-A-C-M.docx
+++ b/AA3-EV05 - Práctica de clase – Scaffolding inicial del Front-End del proyecto sus L-A-C-M.docx
@@ -15,23 +15,7 @@
           <w:b/>
           <w:bCs/>
         </w:rPr>
-        <w:t xml:space="preserve">AA3-EV05 - Práctica de clase – </w:t>
-      </w:r>
-      <w:proofErr w:type="spellStart"/>
-      <w:r>
-        <w:rPr>
-          <w:b/>
-          <w:bCs/>
-        </w:rPr>
-        <w:t>Scaffolding</w:t>
-      </w:r>
-      <w:proofErr w:type="spellEnd"/>
-      <w:r>
-        <w:rPr>
-          <w:b/>
-          <w:bCs/>
-        </w:rPr>
-        <w:t xml:space="preserve"> inicial del Front-End del proyecto</w:t>
+        <w:t>AA3-EV05 - Práctica de clase – Scaffolding inicial del Front-End del proyecto</w:t>
       </w:r>
     </w:p>
     <w:p>
@@ -345,6 +329,7 @@
       </w:pPr>
       <w:r>
         <w:rPr>
+          <w:noProof/>
           <w:lang w:val="es-ES"/>
         </w:rPr>
         <w:drawing>
@@ -385,6 +370,7 @@
       </w:r>
       <w:r>
         <w:rPr>
+          <w:noProof/>
           <w:lang w:val="es-ES"/>
         </w:rPr>
         <w:drawing>
@@ -425,6 +411,7 @@
       </w:r>
       <w:r>
         <w:rPr>
+          <w:noProof/>
           <w:lang w:val="es-ES"/>
         </w:rPr>
         <w:lastRenderedPageBreak/>
@@ -466,6 +453,7 @@
       </w:r>
       <w:r>
         <w:rPr>
+          <w:noProof/>
           <w:lang w:val="es-ES"/>
         </w:rPr>
         <w:drawing>
@@ -506,6 +494,7 @@
       </w:r>
       <w:r>
         <w:rPr>
+          <w:noProof/>
           <w:lang w:val="es-ES"/>
         </w:rPr>
         <w:lastRenderedPageBreak/>
@@ -1204,6 +1193,7 @@
   <w:style w:type="character" w:default="1" w:styleId="Fuentedeprrafopredeter">
     <w:name w:val="Default Paragraph Font"/>
     <w:uiPriority w:val="1"/>
+    <w:semiHidden/>
     <w:unhideWhenUsed/>
   </w:style>
   <w:style w:type="table" w:default="1" w:styleId="Tablanormal">

</xml_diff>